<commit_message>
Make submission documents self-contained
</commit_message>
<xml_diff>
--- a/docs/project/final/ENGI9839_Course_Project_Final_Report.docx
+++ b/docs/project/final/ENGI9839_Course_Project_Final_Report.docx
@@ -1635,13 +1635,7 @@
         <w:spacing w:line="480" w:lineRule="auto"/>
       </w:pPr>
       <w:r>
-        <w:t>This case study compared human-authored deterministic API tests with Schemathesis schema-driven fuzzing on two authenticated endpoints of an existing React and Django e-commerce application. A frozen suite executed 20 human-designed cases and reproduced eight known root causes; three seeded Schemathesis runs generated 3,252 cases and repeatedly reproduced three known input-contract defects. Neither formal technique found a novel root cause. Store-package combined line and branch coverage for the human suite</w:t>
-      </w:r>
-      <w:r>
-        <w:t xml:space="preserve"> was 64.5 percent, while comparable fuzz coverage was unavailable. Two required 90-minute exploratory sessions separately found three novel frontend and authentication-lifecycle defects and reproduced two known defects. The small manual suite could check ownership, persistence, and transaction behavior directly, while schema-driven fuzzing explored malformed inputs at much higher volume and repeated the same failures across seeds. All failures were grouped by root cause, and the conclusions are limited to t</w:t>
-      </w:r>
-      <w:r>
-        <w:t>his application and these two endpoints.</w:t>
+        <w:t>This case study compared human-authored deterministic API tests with Schemathesis schema-driven fuzzing on two authenticated endpoints of an existing React and Django e-commerce application. A frozen suite executed 20 human-designed cases and reproduced eight known root causes; three seeded Schemathesis runs generated 3,252 cases and repeatedly reproduced three known input-contract defects. Neither formal technique found a novel root cause. Store-package combined line and branch coverage for the human suite was 64.5 percent, while comparable fuzz coverage was unavailable. Two required 90-minute exploratory sessions separately found three novel frontend and authentication-lifecycle defects and reproduced two known defects. The small manual suite could check ownership, persistence, and transaction behavior directly, while schema-driven fuzzing explored malformed inputs at much higher volume and repeated the same failures across seeds. All failures were grouped by root cause, and the conclusions are limited to this application and these two endpoints.</w:t>
       </w:r>
     </w:p>
     <w:p>
@@ -1667,10 +1661,7 @@
         <w:spacing w:line="480" w:lineRule="auto"/>
       </w:pPr>
       <w:r>
-        <w:t>Web APIs must reject malformed requests, enforce authorization boundaries, and preserve consistent state across multi-step operations. Conventional tests can encode detailed business and persistence oracles, but their effectiveness depends on which cases a person anticipates. Schema-driven fuzzing can generate many diverse requests automatically, but its results depend on schema accuracy, available response oracles, and the ability to reach meaningful application state. This project evaluates those compleme</w:t>
-      </w:r>
-      <w:r>
-        <w:t>ntary strengths on an existing React and Django e-commerce application.</w:t>
+        <w:t>Web APIs must reject malformed requests, enforce authorization boundaries, and preserve consistent state across multi-step operations. Conventional tests can encode detailed business and persistence oracles, but their effectiveness depends on which cases a person anticipates. Schema-driven fuzzing can generate many diverse requests automatically, but its results depend on schema accuracy, available response oracles, and the ability to reach meaningful application state. This project evaluates those complementary strengths on an existing React and Django e-commerce application.</w:t>
       </w:r>
     </w:p>
     <w:p>
@@ -1715,10 +1706,7 @@
         <w:spacing w:line="480" w:lineRule="auto"/>
       </w:pPr>
       <w:r>
-        <w:t>Schema-driven API fuzzing derives requests from a machine-readable contract. Hatfield-Dodds and Dygalo present Schemathesis as a property-based generator for OpenAPI and GraphQL services [1]. Their evaluation of eight fuzzers on sixteen open-source services reported broad schema compatibility and more unique defects for Schemathesis than the next-best tool on each target. Sartaj, Ali, and Gjøby later included Schemathesis in an industrial study spanning 17 APIs, 120 endpoints, and 14 releases [2]. Their sep</w:t>
-      </w:r>
-      <w:r>
-        <w:t>aration of tests, failures, potential faults, coverage, regressions, and cost supports this project's decision not to treat generated volume as defect count.</w:t>
+        <w:t>Schema-driven API fuzzing derives requests from a machine-readable contract. Hatfield-Dodds and Dygalo present Schemathesis as a property-based generator for OpenAPI and GraphQL services [1]. Their evaluation of eight fuzzers on sixteen open-source services reported broad schema compatibility and more unique defects for Schemathesis than the next-best tool on each target. Sartaj, Ali, and Gjøby later included Schemathesis in an industrial study spanning 17 APIs, 120 endpoints, and 14 releases [2]. Their separation of tests, failures, potential faults, coverage, regressions, and cost supports this project's decision not to treat generated volume as defect count.</w:t>
       </w:r>
     </w:p>
     <w:p>
@@ -1766,7 +1754,10 @@
         <w:spacing w:line="480" w:lineRule="auto"/>
       </w:pPr>
       <w:r>
-        <w:t>The system comprises a React 19 frontend, Django 5.2 and Django REST Framework backend, JWT authentication, and PostgreSQL persistence. The application was already implemented before this project and contained no dedicated verification or validation infrastructure. The immutable application baseline is commit acde2ec2a76e5f9cabbbf1b0cfaaaa46f79b00b4.</w:t>
+        <w:t xml:space="preserve">The system comprises a React 19 frontend, Django 5.2 and Django REST Framework backend, JWT authentication, and PostgreSQL persistence. The application was already implemented before this project and contained no dedicated verification or validation infrastructure. </w:t>
+      </w:r>
+      <w:r>
+        <w:t>The application baseline was frozen before formal execution. No product defects were corrected until the human-authored, Schemathesis, and exploratory baseline activities were completed.</w:t>
       </w:r>
     </w:p>
     <w:p>
@@ -1853,6 +1844,7 @@
         <w:rPr>
           <w:rFonts w:eastAsia="Times New Roman"/>
         </w:rPr>
+        <w:lastRenderedPageBreak/>
         <w:t>4.1 Defect identity and behavioral oracles</w:t>
       </w:r>
       <w:bookmarkEnd w:id="5"/>
@@ -1863,17 +1855,55 @@
         <w:spacing w:line="480" w:lineRule="auto"/>
       </w:pPr>
       <w:r>
+        <w:t>Findings known before formal execution use K identifiers and are excluded from novel-defect counts. Findings first confirmed during valid experimental work use N identifiers. One defect is one distinct root cause; repeated requests, failed checks, and symptom variants are not counted separately.</w:t>
+      </w:r>
+    </w:p>
+    <w:p>
+      <w:pPr>
+        <w:pStyle w:val="NormalWeb"/>
+        <w:spacing w:line="480" w:lineRule="auto"/>
+      </w:pPr>
+      <w:r>
+        <w:t>The principal oracles require that unauthorized users cannot modify another user's data, invalid input receives a documented client response rather than a server error, rejected requests do not mutate persistent state, order creation is atomic, cart and order totals agree, empty carts do not produce orders, required checkout values satisfy the contract, and successful responses conform to the OpenAPI response schema.</w:t>
+      </w:r>
+    </w:p>
+    <w:p>
+      <w:pPr>
+        <w:pStyle w:val="Heading2"/>
+        <w:spacing w:line="480" w:lineRule="auto"/>
+        <w:rPr>
+          <w:rFonts w:eastAsia="Times New Roman"/>
+        </w:rPr>
+      </w:pPr>
+      <w:bookmarkStart w:id="6" w:name="_Toc235102513"/>
+      <w:r>
+        <w:rPr>
+          <w:rFonts w:eastAsia="Times New Roman"/>
+        </w:rPr>
+        <w:t>4.2 Human-authored deterministic testing</w:t>
+      </w:r>
+      <w:bookmarkEnd w:id="6"/>
+    </w:p>
+    <w:p>
+      <w:pPr>
+        <w:pStyle w:val="NormalWeb"/>
+        <w:spacing w:line="480" w:lineRule="auto"/>
+      </w:pPr>
+      <w:r>
+        <w:t>The human-designed technique contains 20 pytest cases: eight for cart update and twelve for order creation, including parameterized input variants. Inputs were selected from authentication, ownership, identifier, quantity, cart-state, phone, required-field, payment-choice, and transaction-failure partitions. Although pytest automates execution, generation and oracle design are human-authored. The proposal used the phrase manual unit testing; in this report, manual means human-authored rather than hand-executed. Because the cases call authenticated API views and inspect PostgreSQL state, they are more accurately described as deterministic API-level integration tests.</w:t>
+      </w:r>
+    </w:p>
+    <w:p>
+      <w:pPr>
+        <w:pStyle w:val="NormalWeb"/>
+        <w:spacing w:line="480" w:lineRule="auto"/>
+      </w:pPr>
+      <w:r>
+        <w:t xml:space="preserve">Known defects are represented as strict expected failures. This retains executable evidence while causing unexpected correction or incorrect classification to fail the run. Tests also inspect database state, totals, ownership, order items, and rollback behavior rather than checking status codes alone. </w:t>
+      </w:r>
+      <w:r>
         <w:lastRenderedPageBreak/>
-        <w:t>Findings known before formal execution use K identifiers and are excluded from novel-defect counts. Findings first confirmed during valid experimental work use N identifiers. One defect is one distinct root cause; repeated requests, failed checks, and symptom variants are not counted separately.</w:t>
-      </w:r>
-    </w:p>
-    <w:p>
-      <w:pPr>
-        <w:pStyle w:val="NormalWeb"/>
-        <w:spacing w:line="480" w:lineRule="auto"/>
-      </w:pPr>
-      <w:r>
-        <w:t>The principal oracles require that unauthorized users cannot modify another user's data, invalid input receives a documented client response rather than a server error, rejected requests do not mutate persistent state, order creation is atomic, cart and order totals agree, empty carts do not produce orders, required checkout values satisfy the contract, and successful responses conform to the OpenAPI response schema.</w:t>
+        <w:t>pytest-django provides the transactional database isolation used by the suite [8], while coverage.py records both line and branch execution [9].</w:t>
       </w:r>
     </w:p>
     <w:p>
@@ -1884,34 +1914,31 @@
           <w:rFonts w:eastAsia="Times New Roman"/>
         </w:rPr>
       </w:pPr>
-      <w:bookmarkStart w:id="6" w:name="_Toc235102513"/>
-      <w:r>
-        <w:rPr>
-          <w:rFonts w:eastAsia="Times New Roman"/>
-        </w:rPr>
-        <w:t>4.2 Human-authored deterministic testing</w:t>
-      </w:r>
-      <w:bookmarkEnd w:id="6"/>
-    </w:p>
-    <w:p>
-      <w:pPr>
-        <w:pStyle w:val="NormalWeb"/>
-        <w:spacing w:line="480" w:lineRule="auto"/>
-      </w:pPr>
-      <w:r>
-        <w:t>The human-designed technique contains 20 pytest cases: eight for cart update and twelve for order creation, including parameterized input variants. Inputs were selected from authentication, ownership, identifier, quantity, cart-state, phone, required-field, payment-choice, and transaction-failure partitions. Although pytest automates execution, generation and oracle design are human-authored. The proposal used the phrase manual unit testing; in this report, manual means human-authored rather than hand-execu</w:t>
-      </w:r>
-      <w:r>
-        <w:t>ted. Because the cases call authenticated API views and inspect PostgreSQL state, they are more accurately described as deterministic API-level integration tests.</w:t>
-      </w:r>
-    </w:p>
-    <w:p>
-      <w:pPr>
-        <w:pStyle w:val="NormalWeb"/>
-        <w:spacing w:line="480" w:lineRule="auto"/>
-      </w:pPr>
-      <w:r>
-        <w:t>Known defects are represented as strict expected failures. This retains executable evidence while causing unexpected correction or incorrect classification to fail the run. Tests also inspect database state, totals, ownership, order items, and rollback behavior rather than checking status codes alone. pytest-django provides the transactional database isolation used by the suite [8], while coverage.py records both line and branch execution [9].</w:t>
+      <w:bookmarkStart w:id="7" w:name="_Toc235102514"/>
+      <w:r>
+        <w:rPr>
+          <w:rFonts w:eastAsia="Times New Roman"/>
+        </w:rPr>
+        <w:t>4.3 Schema-driven fuzzing</w:t>
+      </w:r>
+      <w:bookmarkEnd w:id="7"/>
+    </w:p>
+    <w:p>
+      <w:pPr>
+        <w:pStyle w:val="NormalWeb"/>
+        <w:spacing w:line="480" w:lineRule="auto"/>
+      </w:pPr>
+      <w:r>
+        <w:t>drf-spectacular generates an OpenAPI 3.0.3 contract restricted to the two experiment endpoints. Request schemas describe documented fields and constraints, while response schemas include application and framework error bodies. Only JSON request media is advertised. The tool supports customizable OpenAPI generation for Django REST Framework views and serializers [6].</w:t>
+      </w:r>
+    </w:p>
+    <w:p>
+      <w:pPr>
+        <w:pStyle w:val="NormalWeb"/>
+        <w:spacing w:line="480" w:lineRule="auto"/>
+      </w:pPr>
+      <w:r>
+        <w:t>Schemathesis 4.22.4 runs positive, negative, coverage, and fuzzing phases with checks for server errors, status and content-type conformance, response-schema conformance, and negative-data rejection. A hook restores the isolated experiment user's cart and order state before every generated call so one case cannot empty the cart or create an order that changes the next case's reachable behavior. Three formal seeds use a maximum of 500 fuzz examples per operation. Schemathesis documents phase, check, example-budget, authentication, and hook configuration through its command-line and TOML interfaces [7].</w:t>
       </w:r>
     </w:p>
     <w:p>
@@ -1922,35 +1949,26 @@
           <w:rFonts w:eastAsia="Times New Roman"/>
         </w:rPr>
       </w:pPr>
-      <w:bookmarkStart w:id="7" w:name="_Toc235102514"/>
-      <w:r>
-        <w:rPr>
-          <w:rFonts w:eastAsia="Times New Roman"/>
-        </w:rPr>
+      <w:bookmarkStart w:id="8" w:name="_Toc235102515"/>
+      <w:r>
+        <w:rPr>
+          <w:rFonts w:eastAsia="Times New Roman"/>
+        </w:rPr>
+        <w:t>4.4 Exploratory testing</w:t>
+      </w:r>
+      <w:bookmarkEnd w:id="8"/>
+    </w:p>
+    <w:p>
+      <w:pPr>
+        <w:pStyle w:val="NormalWeb"/>
+        <w:spacing w:line="480" w:lineRule="auto"/>
+      </w:pPr>
+      <w:r>
+        <w:t xml:space="preserve">Exploratory work is reported separately. E-01 used a 90-minute business and data-flow charter with Guidebook and Fed-Ex tours. A deterministic environment captured before, checkpoint, and after database snapshots plus Django and Vite logs. The tester chose subsequent actions from observations and completed a debrief. E-02 used a separate 90-minute validation and misuse charter with Couch Potato, Saboteur, and Antisocial tours. It followed checkout validation, </w:t>
+      </w:r>
+      <w:r>
         <w:lastRenderedPageBreak/>
-        <w:t>4.3 Schema-driven fuzzing</w:t>
-      </w:r>
-      <w:bookmarkEnd w:id="7"/>
-    </w:p>
-    <w:p>
-      <w:pPr>
-        <w:pStyle w:val="NormalWeb"/>
-        <w:spacing w:line="480" w:lineRule="auto"/>
-      </w:pPr>
-      <w:r>
-        <w:t>drf-spectacular generates an OpenAPI 3.0.3 contract restricted to the two experiment endpoints. Request schemas describe documented fields and constraints, while response schemas include application and framework error bodies. Only JSON request media is advertised. The tool supports customizable OpenAPI generation for Django REST Framework views and serializers [6].</w:t>
-      </w:r>
-    </w:p>
-    <w:p>
-      <w:pPr>
-        <w:pStyle w:val="NormalWeb"/>
-        <w:spacing w:line="480" w:lineRule="auto"/>
-      </w:pPr>
-      <w:r>
-        <w:t>Schemathesis 4.22.4 runs positive, negative, coverage, and fuzzing phases with checks for server errors, status and content-type conformance, response-schema conformance, and negative-data rejection. A hook restores the isolated experiment user's cart and order state before every generated call so one case cannot empty the cart or create an order that changes the next case's reachable behavior. Three formal seeds use a maximum of 500 fuzz examples per operation. Schemathesis documents phase, check, example-</w:t>
-      </w:r>
-      <w:r>
-        <w:t>budget, authentication, and hook configuration through its command-line and TOML interfaces [7].</w:t>
+        <w:t>authentication expiry, state preservation, and punctuation handling from each preceding observation rather than executing a fixed case list.</w:t>
       </w:r>
     </w:p>
     <w:p>
@@ -1961,25 +1979,76 @@
           <w:rFonts w:eastAsia="Times New Roman"/>
         </w:rPr>
       </w:pPr>
-      <w:bookmarkStart w:id="8" w:name="_Toc235102515"/>
-      <w:r>
-        <w:rPr>
-          <w:rFonts w:eastAsia="Times New Roman"/>
-        </w:rPr>
-        <w:t>4.4 Exploratory testing</w:t>
-      </w:r>
-      <w:bookmarkEnd w:id="8"/>
-    </w:p>
-    <w:p>
-      <w:pPr>
-        <w:pStyle w:val="NormalWeb"/>
-        <w:spacing w:line="480" w:lineRule="auto"/>
-      </w:pPr>
-      <w:r>
-        <w:t>Exploratory work is reported separately. E-01 used a 90-minute business and data-flow charter with Guidebook and Fed-Ex tours. A deterministic environment captured before, checkpoint, and after database snapshots plus Django and Vite logs. The tester chose subsequent actions from observations and completed a debrief. E-02 used a separate 90-minute validation and misuse charter with Couch Potato, Saboteur, and Antisocial tours. It followed checkout validation, authentication expiry, state preservation, and p</w:t>
-      </w:r>
-      <w:r>
-        <w:t>unctuation handling from each preceding observation rather than executing a fixed case list.</w:t>
+      <w:bookmarkStart w:id="9" w:name="_Toc235102516"/>
+      <w:r>
+        <w:rPr>
+          <w:rFonts w:eastAsia="Times New Roman"/>
+        </w:rPr>
+        <w:t>4.5 Measures and comparison controls</w:t>
+      </w:r>
+      <w:bookmarkEnd w:id="9"/>
+    </w:p>
+    <w:p>
+      <w:pPr>
+        <w:pStyle w:val="NormalWeb"/>
+        <w:spacing w:line="480" w:lineRule="auto"/>
+      </w:pPr>
+      <w:r>
+        <w:t>The primary outcome is the number of unique confirmed root causes reproduced or discovered by each formal technique. Secondary outcomes are generated or executed case count, raw failed cases, false classifications, fault type, coverage where measured comparably, tool wall-clock duration, and available human-effort estimates. A defect identity requires a distinct cause, not merely a different malformed value or a second failed assertion. K identifiers denote behavior known before formal execution; N identifiers denote roots first found during valid experimental activity.</w:t>
+      </w:r>
+    </w:p>
+    <w:p>
+      <w:pPr>
+        <w:pStyle w:val="NormalWeb"/>
+        <w:spacing w:line="480" w:lineRule="auto"/>
+      </w:pPr>
+      <w:r>
+        <w:t>Both techniques target the same baseline revision and endpoints, but they use the kinds of oracles for which they were designed. The manual suite inspects persistence, ownership, totals, and transaction rollback, while Schemathesis applies black-box response and schema properties. The difference in oracle depth is therefore part of the comparison rather than something artificially removed from it. The isolated manual database, dedicated fuzz database, deterministic seed, and per-generated-case reset limit cross-case contamination. Exploratory results are kept outside the direct manual-versus-fuzzing count because they cover a broader frontend journey.</w:t>
+      </w:r>
+    </w:p>
+    <w:p>
+      <w:pPr>
+        <w:pStyle w:val="Heading1"/>
+        <w:spacing w:line="480" w:lineRule="auto"/>
+        <w:rPr>
+          <w:rFonts w:eastAsia="Times New Roman"/>
+        </w:rPr>
+      </w:pPr>
+      <w:bookmarkStart w:id="10" w:name="_Toc235102517"/>
+      <w:r>
+        <w:rPr>
+          <w:rFonts w:eastAsia="Times New Roman"/>
+        </w:rPr>
+        <w:t>5. Verification infrastructure implementation</w:t>
+      </w:r>
+      <w:bookmarkEnd w:id="10"/>
+    </w:p>
+    <w:p>
+      <w:pPr>
+        <w:pStyle w:val="NormalWeb"/>
+        <w:spacing w:line="480" w:lineRule="auto"/>
+      </w:pPr>
+      <w:r>
+        <w:t>Separate Django settings prevent the automatically managed test database and standalone fuzz database from matching the development database. A management command creates two deterministic users, two products, carts, and known quantities. Another command serializes experiment-owned cart, order, and line state as JSON for exploratory evidence.</w:t>
+      </w:r>
+    </w:p>
+    <w:p>
+      <w:pPr>
+        <w:pStyle w:val="NormalWeb"/>
+        <w:spacing w:line="480" w:lineRule="auto"/>
+      </w:pPr>
+      <w:r>
+        <w:lastRenderedPageBreak/>
+        <w:t>The manual runner erases prior coverage data, executes the frozen suite, writes JUnit and coverage XML, produces HTML coverage, and records wall-clock time. The Schemathesis runner obtains a fresh JWT, limits execution to the selected paths, records the seed and budget, and saves the complete console log.</w:t>
+      </w:r>
+    </w:p>
+    <w:p>
+      <w:pPr>
+        <w:pStyle w:val="NormalWeb"/>
+        <w:spacing w:line="480" w:lineRule="auto"/>
+      </w:pPr>
+      <w:r>
+        <w:t>An exploratory launcher verifies that ports are free, resets only experiment records, starts the isolated Django server and Vite frontend, waits for both services, and writes a before snapshot. The stop workflow captures after state and terminates only the documented Python and Node listeners. A separate READINESS rehearsal validated service startup, authentication, CORS, snapshots, and clean shutdown before E-01.</w:t>
       </w:r>
     </w:p>
     <w:p>
@@ -1990,38 +2059,62 @@
           <w:rFonts w:eastAsia="Times New Roman"/>
         </w:rPr>
       </w:pPr>
-      <w:bookmarkStart w:id="9" w:name="_Toc235102516"/>
-      <w:r>
-        <w:rPr>
-          <w:rFonts w:eastAsia="Times New Roman"/>
-        </w:rPr>
-        <w:t>4.5 Measures and comparison controls</w:t>
-      </w:r>
-      <w:bookmarkEnd w:id="9"/>
-    </w:p>
-    <w:p>
-      <w:pPr>
-        <w:pStyle w:val="NormalWeb"/>
-        <w:spacing w:line="480" w:lineRule="auto"/>
-      </w:pPr>
+      <w:bookmarkStart w:id="11" w:name="_Toc235102518"/>
+      <w:r>
+        <w:rPr>
+          <w:rFonts w:eastAsia="Times New Roman"/>
+        </w:rPr>
+        <w:t>5.1 Implementation challenges and responses</w:t>
+      </w:r>
+      <w:bookmarkEnd w:id="11"/>
+    </w:p>
+    <w:p>
+      <w:pPr>
+        <w:pStyle w:val="NormalWeb"/>
+        <w:spacing w:line="480" w:lineRule="auto"/>
+      </w:pPr>
+      <w:r>
+        <w:t>Several practical problems arose during setup and execution. Preliminary code inspection had already exposed several product defects. Fixing those defects before the experiment would have changed the subject and made the techniques operate on different behavior. The project therefore froze the application, registered the issues as known K defects, and separated test instrumentation from product corrections. As a result, the formal runs mainly reproduced known defects rather than discovering new ones. That is still a valid outcome and is reported without inflating the novel-defect count.</w:t>
+      </w:r>
+    </w:p>
+    <w:p>
+      <w:pPr>
+        <w:pStyle w:val="NormalWeb"/>
+        <w:spacing w:line="480" w:lineRule="auto"/>
+      </w:pPr>
+      <w:r>
+        <w:t xml:space="preserve">Database state was another central challenge. Cart update and order creation are destructive operations, and a successful order empties the cart. Separate test and fuzz databases, database-name guards, deterministic seed data, snapshots, and per-generated-case restoration were needed both to protect development data and to keep generated cases comparable. The reset hook </w:t>
+      </w:r>
       <w:r>
         <w:lastRenderedPageBreak/>
-        <w:t>The primary outcome is the number of unique confirmed root causes reproduced or discovered by each formal technique. Secondary outcomes are generated or executed case count, raw failed cases, false classifications, fault type, coverage where measured comparably, tool wall-clock duration, and available human-effort estimates. A defect identity requires a distinct cause, not merely a different malformed value or a second failed assertion. K identifiers denote behavior known before formal execution; N identifi</w:t>
-      </w:r>
-      <w:r>
-        <w:t>ers denote roots first found during valid experimental activity.</w:t>
-      </w:r>
-    </w:p>
-    <w:p>
-      <w:pPr>
-        <w:pStyle w:val="NormalWeb"/>
-        <w:spacing w:line="480" w:lineRule="auto"/>
-      </w:pPr>
-      <w:r>
-        <w:t>Both techniques target the same baseline revision and endpoints, but they use the kinds of oracles for which they were designed. The manual suite inspects persistence, ownership, totals, and transaction rollback, while Schemathesis applies black-box response and schema properties. The difference in oracle depth is therefore part of the comparison rather than something artificially removed from it. The isolated manual database, dedicated fuzz database, deterministic seed, and per-generated-case reset limit c</w:t>
-      </w:r>
-      <w:r>
-        <w:t>ross-case contamination. Exploratory results are kept outside the direct manual-versus-fuzzing count because they cover a broader frontend journey.</w:t>
+        <w:t>increased repeatability, but it also imposed a controlled state that does not represent every possible production sequence.</w:t>
+      </w:r>
+    </w:p>
+    <w:p>
+      <w:pPr>
+        <w:pStyle w:val="NormalWeb"/>
+        <w:spacing w:line="480" w:lineRule="auto"/>
+      </w:pPr>
+      <w:r>
+        <w:t>The OpenAPI contract and test harness also needed refinement. Early Schemathesis checks exposed inaccurate descriptions of framework 401 and parse-error bodies, as well as incorrect request-media assumptions. These were test-setup problems rather than application defects, so the test-only schema was corrected and the pre-formal logs retained. A later F-01 attempt was stopped when the surrounding command reached its time limit. Its partial log was preserved as invalid, and the run was repeated with the same seed, schema, budget, baseline, and reset hook; only the external allowance changed.</w:t>
+      </w:r>
+    </w:p>
+    <w:p>
+      <w:pPr>
+        <w:pStyle w:val="NormalWeb"/>
+        <w:spacing w:line="480" w:lineRule="auto"/>
+      </w:pPr>
+      <w:r>
+        <w:t>Triage introduced a different challenge. M-01 unexpectedly passed the proposed K-008 malformed-item-identifier case. Investigation showed that the original smoke evidence actually contained a valid identifier and malformed quantity, so K-008 duplicated K-002. Rejecting the classification reduced the defect count but improved validity. During exploration, JWT expiry interrupted intended workflows and produced misleading empty-cart and Order failed states. Request logs, snapshots, reauthentication, and identical retries were required to separate authentication failure from cart loss or address punctuation.</w:t>
+      </w:r>
+    </w:p>
+    <w:p>
+      <w:pPr>
+        <w:pStyle w:val="NormalWeb"/>
+        <w:spacing w:line="480" w:lineRule="auto"/>
+      </w:pPr>
+      <w:r>
+        <w:t>Human effort collection was imperfect. Time for manual-suite design, fuzz configuration, and triage was not recorded prospectively and cannot now be reconstructed defensibly. Those values are reported as unavailable rather than replaced with tool runtime. The complete challenge register and mitigations are preserved in implementation-challenges.md.</w:t>
       </w:r>
     </w:p>
     <w:p>
@@ -2032,32 +2125,14 @@
           <w:rFonts w:eastAsia="Times New Roman"/>
         </w:rPr>
       </w:pPr>
-      <w:bookmarkStart w:id="10" w:name="_Toc235102517"/>
-      <w:r>
-        <w:rPr>
-          <w:rFonts w:eastAsia="Times New Roman"/>
-        </w:rPr>
-        <w:t>5. Verification infrastructure implementation</w:t>
-      </w:r>
-      <w:bookmarkEnd w:id="10"/>
-    </w:p>
-    <w:p>
-      <w:pPr>
-        <w:pStyle w:val="NormalWeb"/>
-        <w:spacing w:line="480" w:lineRule="auto"/>
-      </w:pPr>
-      <w:r>
-        <w:t>Separate Django settings prevent the automatically managed test database and standalone fuzz database from matching the development database. A management command creates two deterministic users, two products, carts, and known quantities. Another command serializes experiment-owned cart, order, and line state as JSON for exploratory evidence.</w:t>
-      </w:r>
-    </w:p>
-    <w:p>
-      <w:pPr>
-        <w:pStyle w:val="NormalWeb"/>
-        <w:spacing w:line="480" w:lineRule="auto"/>
-      </w:pPr>
-      <w:r>
-        <w:t>The manual runner erases prior coverage data, executes the frozen suite, writes JUnit and coverage XML, produces HTML coverage, and records wall-clock time. The Schemathesis runner obtains a fresh JWT, limits execution to the selected paths, records the seed and budget, and saves the complete console log.</w:t>
-      </w:r>
+      <w:bookmarkStart w:id="12" w:name="_Toc235102519"/>
+      <w:r>
+        <w:rPr>
+          <w:rFonts w:eastAsia="Times New Roman"/>
+        </w:rPr>
+        <w:t>6. Results</w:t>
+      </w:r>
+      <w:bookmarkEnd w:id="12"/>
     </w:p>
     <w:p>
       <w:pPr>
@@ -2066,104 +2141,6 @@
       </w:pPr>
       <w:r>
         <w:lastRenderedPageBreak/>
-        <w:t>An exploratory launcher verifies that ports are free, resets only experiment records, starts the isolated Django server and Vite frontend, waits for both services, and writes a before snapshot. The stop workflow captures after state and terminates only the documented Python and Node listeners. A separate READINESS rehearsal validated service startup, authentication, CORS, snapshots, and clean shutdown before E-01.</w:t>
-      </w:r>
-    </w:p>
-    <w:p>
-      <w:pPr>
-        <w:pStyle w:val="Heading2"/>
-        <w:spacing w:line="480" w:lineRule="auto"/>
-        <w:rPr>
-          <w:rFonts w:eastAsia="Times New Roman"/>
-        </w:rPr>
-      </w:pPr>
-      <w:bookmarkStart w:id="11" w:name="_Toc235102518"/>
-      <w:r>
-        <w:rPr>
-          <w:rFonts w:eastAsia="Times New Roman"/>
-        </w:rPr>
-        <w:t>5.1 Implementation challenges and responses</w:t>
-      </w:r>
-      <w:bookmarkEnd w:id="11"/>
-    </w:p>
-    <w:p>
-      <w:pPr>
-        <w:pStyle w:val="NormalWeb"/>
-        <w:spacing w:line="480" w:lineRule="auto"/>
-      </w:pPr>
-      <w:r>
-        <w:t>Several practical problems arose during setup and execution. Preliminary code inspection had already exposed several product defects. Fixing those defects before the experiment would have changed the subject and made the techniques operate on different behavior. The project therefore froze the application, registered the issues as known K defects, and separated test instrumentation from product corrections. As a result, the formal runs mainly reproduced known defects rather than discovering new ones. That i</w:t>
-      </w:r>
-      <w:r>
-        <w:t>s still a valid outcome and is reported without inflating the novel-defect count.</w:t>
-      </w:r>
-    </w:p>
-    <w:p>
-      <w:pPr>
-        <w:pStyle w:val="NormalWeb"/>
-        <w:spacing w:line="480" w:lineRule="auto"/>
-      </w:pPr>
-      <w:r>
-        <w:t>Database state was another central challenge. Cart update and order creation are destructive operations, and a successful order empties the cart. Separate test and fuzz databases, database-name guards, deterministic seed data, snapshots, and per-generated-case restoration were needed both to protect development data and to keep generated cases comparable. The reset hook increased repeatability, but it also imposed a controlled state that does not represent every possible production sequence.</w:t>
-      </w:r>
-    </w:p>
-    <w:p>
-      <w:pPr>
-        <w:pStyle w:val="NormalWeb"/>
-        <w:spacing w:line="480" w:lineRule="auto"/>
-      </w:pPr>
-      <w:r>
-        <w:t xml:space="preserve">The OpenAPI contract and test harness also needed refinement. Early Schemathesis checks exposed inaccurate descriptions of framework 401 and parse-error bodies, as well as incorrect request-media assumptions. These were test-setup problems rather than application defects, so the </w:t>
-      </w:r>
-      <w:r>
-        <w:lastRenderedPageBreak/>
-        <w:t>test-only schema was corrected and the pre-formal logs retained. A later F-01 attempt was stopped when the surrounding command reached its time limit. Its partial log was preserved as invalid, and the run was repeated with the same seed, schema, budget, baseline, and reset hook; only the external allowance changed.</w:t>
-      </w:r>
-    </w:p>
-    <w:p>
-      <w:pPr>
-        <w:pStyle w:val="NormalWeb"/>
-        <w:spacing w:line="480" w:lineRule="auto"/>
-      </w:pPr>
-      <w:r>
-        <w:t>Triage introduced a different challenge. M-01 unexpectedly passed the proposed K-008 malformed-item-identifier case. Investigation showed that the original smoke evidence actually contained a valid identifier and malformed quantity, so K-008 duplicated K-002. Rejecting the classification reduced the defect count but improved validity. During exploration, JWT expiry interrupted intended workflows and produced misleading empty-cart and Order failed states. Request logs, snapshots, reauthentication, and identi</w:t>
-      </w:r>
-      <w:r>
-        <w:t>cal retries were required to separate authentication failure from cart loss or address punctuation.</w:t>
-      </w:r>
-    </w:p>
-    <w:p>
-      <w:pPr>
-        <w:pStyle w:val="NormalWeb"/>
-        <w:spacing w:line="480" w:lineRule="auto"/>
-      </w:pPr>
-      <w:r>
-        <w:t>Human effort collection was imperfect. Time for manual-suite design, fuzz configuration, and triage was not recorded prospectively and cannot now be reconstructed defensibly. Those values are reported as unavailable rather than replaced with tool runtime. The complete challenge register and mitigations are preserved in implementation-challenges.md.</w:t>
-      </w:r>
-    </w:p>
-    <w:p>
-      <w:pPr>
-        <w:pStyle w:val="Heading1"/>
-        <w:spacing w:line="480" w:lineRule="auto"/>
-        <w:rPr>
-          <w:rFonts w:eastAsia="Times New Roman"/>
-        </w:rPr>
-      </w:pPr>
-      <w:bookmarkStart w:id="12" w:name="_Toc235102519"/>
-      <w:r>
-        <w:rPr>
-          <w:rFonts w:eastAsia="Times New Roman"/>
-        </w:rPr>
-        <w:t>6. Results</w:t>
-      </w:r>
-      <w:bookmarkEnd w:id="12"/>
-    </w:p>
-    <w:p>
-      <w:pPr>
-        <w:pStyle w:val="NormalWeb"/>
-        <w:spacing w:line="480" w:lineRule="auto"/>
-      </w:pPr>
-      <w:r>
         <w:t>The principal quantitative results are summarized below. Raw failures are kept separate from unique defects to prevent repeated manifestations from inflating effectiveness.</w:t>
       </w:r>
     </w:p>
@@ -2666,7 +2643,6 @@
                 <w:sz w:val="20"/>
                 <w:szCs w:val="20"/>
               </w:rPr>
-              <w:lastRenderedPageBreak/>
               <w:t>Unique novel defects</w:t>
             </w:r>
           </w:p>
@@ -3245,7 +3221,11 @@
         <w:spacing w:line="480" w:lineRule="auto"/>
       </w:pPr>
       <w:r>
-        <w:t>The manual suite reproduced eight unique known defects: K-001 through K-007 and K-009. These included cross-user modification, mutation on rejected input, unhandled types, missing checkout persistence, and non-atomic order creation. No novel defect was confirmed by the formal manual run.</w:t>
+        <w:t xml:space="preserve">The manual suite reproduced eight unique known defects: K-001 through K-007 and K-009. These included cross-user modification, mutation on rejected input, unhandled types, missing checkout </w:t>
+      </w:r>
+      <w:r>
+        <w:lastRenderedPageBreak/>
+        <w:t>persistence, and non-atomic order creation. No novel defect was confirmed by the formal manual run.</w:t>
       </w:r>
     </w:p>
     <w:p>
@@ -3271,58 +3251,55 @@
         <w:spacing w:line="480" w:lineRule="auto"/>
       </w:pPr>
       <w:r>
-        <w:t xml:space="preserve">F-01, F-02, and F-03 each generated 1,084 cases. Across 3,252 cases, nine cases failed fifteen raw checks in 552.58 seconds. All three seeds reduced to the same known root causes: a malformed </w:t>
+        <w:t>F-01, F-02, and F-03 each generated 1,084 cases. Across 3,252 cases, nine cases failed fifteen raw checks in 552.58 seconds. All three seeds reduced to the same known root causes: a malformed quantity caused a server error (K-002), a missing phone caused a server error (K-004), and a missing name was accepted (K-009). No new root cause was found.</w:t>
+      </w:r>
+    </w:p>
+    <w:p>
+      <w:pPr>
+        <w:pStyle w:val="NormalWeb"/>
+        <w:spacing w:line="480" w:lineRule="auto"/>
+      </w:pPr>
+      <w:r>
+        <w:t>An initial F-01 attempt was terminated by an external orchestration timeout and is retained as an invalid partial artifact. The valid repeat changed only the external process allowance, not the seed, schema, budget, baseline, or reset hook. Earlier smoke checks exposed provisional 401 and parse-error schema inaccuracies. Those instrumentation artifacts were corrected before formal execution and are not counted as application failures.</w:t>
+      </w:r>
+    </w:p>
+    <w:p>
+      <w:pPr>
+        <w:pStyle w:val="Heading2"/>
+        <w:spacing w:line="480" w:lineRule="auto"/>
+        <w:rPr>
+          <w:rFonts w:eastAsia="Times New Roman"/>
+        </w:rPr>
+      </w:pPr>
+      <w:bookmarkStart w:id="15" w:name="_Toc235102522"/>
+      <w:r>
+        <w:rPr>
+          <w:rFonts w:eastAsia="Times New Roman"/>
+        </w:rPr>
+        <w:t>6.3 Exploratory E-01</w:t>
+      </w:r>
+      <w:bookmarkEnd w:id="15"/>
+    </w:p>
+    <w:p>
+      <w:pPr>
+        <w:pStyle w:val="NormalWeb"/>
+        <w:spacing w:line="480" w:lineRule="auto"/>
+      </w:pPr>
+      <w:r>
+        <w:t>Olaleye completed E-01 in 90 minutes 13 seconds and estimated 30 minutes for test design and execution and 60 minutes for investigation and reporting. The session covered login, one- and two-product carts, add, remove, normal quantity changes, badge semantics, totals, refresh, COD checkout, order persistence, and cart cleanup.</w:t>
+      </w:r>
+    </w:p>
+    <w:p>
+      <w:pPr>
+        <w:pStyle w:val="NormalWeb"/>
+        <w:spacing w:line="480" w:lineRule="auto"/>
+      </w:pPr>
+      <w:r>
+        <w:t xml:space="preserve">Three novel defects were confirmed. N-001 occurs because a successful login stores tokens and navigates home but does not trigger a cart refetch; persistent items and the badge remain hidden until a full frontend reload. N-002 occurs after token expiry: unauthorized cart responses are interpreted as empty cart data while Navbar continues to show Logout based only on token </w:t>
       </w:r>
       <w:r>
         <w:lastRenderedPageBreak/>
-        <w:t>quantity caused a server error (K-002), a missing phone caused a server error (K-004), and a missing name was accepted (K-009). No new root cause was found.</w:t>
-      </w:r>
-    </w:p>
-    <w:p>
-      <w:pPr>
-        <w:pStyle w:val="NormalWeb"/>
-        <w:spacing w:line="480" w:lineRule="auto"/>
-      </w:pPr>
-      <w:r>
-        <w:t>An initial F-01 attempt was terminated by an external orchestration timeout and is retained as an invalid partial artifact. The valid repeat changed only the external process allowance, not the seed, schema, budget, baseline, or reset hook. Earlier smoke checks exposed provisional 401 and parse-error schema inaccuracies. Those instrumentation artifacts were corrected before formal execution and are not counted as application failures.</w:t>
-      </w:r>
-    </w:p>
-    <w:p>
-      <w:pPr>
-        <w:pStyle w:val="Heading2"/>
-        <w:spacing w:line="480" w:lineRule="auto"/>
-        <w:rPr>
-          <w:rFonts w:eastAsia="Times New Roman"/>
-        </w:rPr>
-      </w:pPr>
-      <w:bookmarkStart w:id="15" w:name="_Toc235102522"/>
-      <w:r>
-        <w:rPr>
-          <w:rFonts w:eastAsia="Times New Roman"/>
-        </w:rPr>
-        <w:t>6.3 Exploratory E-01</w:t>
-      </w:r>
-      <w:bookmarkEnd w:id="15"/>
-    </w:p>
-    <w:p>
-      <w:pPr>
-        <w:pStyle w:val="NormalWeb"/>
-        <w:spacing w:line="480" w:lineRule="auto"/>
-      </w:pPr>
-      <w:r>
-        <w:t>Olaleye completed E-01 in 90 minutes 13 seconds and estimated 30 minutes for test design and execution and 60 minutes for investigation and reporting. The session covered login, one- and two-product carts, add, remove, normal quantity changes, badge semantics, totals, refresh, COD checkout, order persistence, and cart cleanup.</w:t>
-      </w:r>
-    </w:p>
-    <w:p>
-      <w:pPr>
-        <w:pStyle w:val="NormalWeb"/>
-        <w:spacing w:line="480" w:lineRule="auto"/>
-      </w:pPr>
-      <w:r>
-        <w:t>Three novel defects were confirmed. N-001 occurs because a successful login stores tokens and navigates home but does not trigger a cart refetch; persistent items and the badge remain hidden until a full frontend reload. N-002 occurs after token expiry: unauthorized cart responses are interpreted as empty cart data while Navbar continues to show Logout based only on token presence. A JSON snapshot proved that Table quantity 2 and total 251.00 remained in PostgreSQL while the UI claimed the cart was empty. N</w:t>
-      </w:r>
-      <w:r>
-        <w:t>-003 occurs when products have no image: the resolver returns an empty string and product components render it as an image source, producing repeated React warnings.</w:t>
+        <w:t>presence. A JSON snapshot proved that Table quantity 2 and total 251.00 remained in PostgreSQL while the UI claimed the cart was empty. N-003 occurs when products have no image: the resolver returns an empty string and product components render it as an image source, producing repeated React warnings.</w:t>
       </w:r>
     </w:p>
     <w:p>
@@ -3355,11 +3332,7 @@
         <w:t>Logout</w:t>
       </w:r>
       <w:r>
-        <w:t xml:space="preserve">. If the screenshot also contains the Network 401, retain </w:t>
-      </w:r>
-      <w:r>
-        <w:lastRenderedPageBreak/>
-        <w:t xml:space="preserve">that portion. Suggested caption: </w:t>
+        <w:t xml:space="preserve">. If the screenshot also contains the Network 401, retain that portion. Suggested caption: </w:t>
       </w:r>
       <w:r>
         <w:rPr>
@@ -3430,10 +3403,7 @@
         <w:spacing w:line="480" w:lineRule="auto"/>
       </w:pPr>
       <w:r>
-        <w:t xml:space="preserve">Olaleye completed E-02 in exactly 90 minutes and estimated 30 minutes for test design and execution and 60 minutes for investigation and evidence reporting. The initial short-phone control, 709764, was rejected with HTTP 400 and an Invalid Phone number message without changing the cart. In contrast, the 17-digit value 70911122299988874 produced HTTP 200, created an order, and cleared the cart. Whitespace-only name and address values also produced successful orders. These three symptoms were deduplicated to </w:t>
-      </w:r>
-      <w:r>
-        <w:t>known K-009, missing checkout request validation, rather than counted as novel defects.</w:t>
+        <w:t>Olaleye completed E-02 in exactly 90 minutes and estimated 30 minutes for test design and execution and 60 minutes for investigation and evidence reporting. The initial short-phone control, 709764, was rejected with HTTP 400 and an Invalid Phone number message without changing the cart. In contrast, the 17-digit value 70911122299988874 produced HTTP 200, created an order, and cleared the cart. Whitespace-only name and address values also produced successful orders. These three symptoms were deduplicated to known K-009, missing checkout request validation, rather than counted as novel defects.</w:t>
       </w:r>
     </w:p>
     <w:p>
@@ -3445,6 +3415,7 @@
         <w:rPr>
           <w:rStyle w:val="Strong"/>
         </w:rPr>
+        <w:lastRenderedPageBreak/>
         <w:t>Figure placeholder E-02-A:</w:t>
       </w:r>
       <w:r>
@@ -3487,11 +3458,7 @@
         <w:spacing w:line="480" w:lineRule="auto"/>
       </w:pPr>
       <w:r>
-        <w:lastRenderedPageBreak/>
-        <w:t>A short numeric address was accepted but retained only as a domain observation because no requirement established an address-format oracle. A phone containing an at sign was correctly rejected. A punctuation-rich address containing an apostrophe, period, comma, and at sign first appeared to fail with generic Order failed, but the request was HTTP 401 after JWT expiry. After reauthentication, the identical address succeeded. This isolated punctuation from the failure and reproduced N-002 in checkout: authent</w:t>
-      </w:r>
-      <w:r>
-        <w:t>ication expiry is not presented as a clear need to log in again. Snapshots confirmed that rejected and unauthorized calls preserved cart state. Each successful checkout also reproduced K-006 because the supplied customer details were absent from persisted order data.</w:t>
+        <w:t>A short numeric address was accepted but retained only as a domain observation because no requirement established an address-format oracle. A phone containing an at sign was correctly rejected. A punctuation-rich address containing an apostrophe, period, comma, and at sign first appeared to fail with generic Order failed, but the request was HTTP 401 after JWT expiry. After reauthentication, the identical address succeeded. This isolated punctuation from the failure and reproduced N-002 in checkout: authentication expiry is not presented as a clear need to log in again. Snapshots confirmed that rejected and unauthorized calls preserved cart state. Each successful checkout also reproduced K-006 because the supplied customer details were absent from persisted order data.</w:t>
       </w:r>
     </w:p>
     <w:p>
@@ -3556,57 +3523,48 @@
         <w:spacing w:line="480" w:lineRule="auto"/>
       </w:pPr>
       <w:r>
-        <w:t>The primary comparison shows complementarity rather than a universal winner. The manual suite reproduced eight known root causes with 20 carefully selected cases because it encoded ownership, persistent-state, transaction, and injected-failure oracles. Schemathesis produced far more inputs and repeatedly identified three input-contract failures, but response-level black-box checks could not directly identify missing checkout persistence or partial database transactions.</w:t>
-      </w:r>
-    </w:p>
-    <w:p>
-      <w:pPr>
-        <w:pStyle w:val="NormalWeb"/>
-        <w:spacing w:line="480" w:lineRule="auto"/>
-      </w:pPr>
-      <w:r>
-        <w:t xml:space="preserve">Generated volume did not translate directly to unique defects: 3,252 formal cases reduced to three already-known root causes. This does not make generation valueless; it demonstrates repeatability </w:t>
+        <w:t xml:space="preserve">The primary comparison shows complementarity rather than a universal winner. The manual suite reproduced eight known root causes with 20 carefully selected cases because it encoded </w:t>
       </w:r>
       <w:r>
         <w:lastRenderedPageBreak/>
-        <w:t>across seeds and exercises malformed input classes without manually enumerating them. It also illustrates the study by Sartaj et al. [2], where many generated tests did not expose failures and cost and deduplication remained important.</w:t>
-      </w:r>
-    </w:p>
-    <w:p>
-      <w:pPr>
-        <w:pStyle w:val="NormalWeb"/>
-        <w:spacing w:line="480" w:lineRule="auto"/>
-      </w:pPr>
-      <w:r>
-        <w:t>Exploratory testing found three novel frontend and lifecycle defects because it followed the visible cart-to-order journey instead of stopping at the two API operations. Those findings do not prove that exploratory testing was superior over the primary techniques: scope and oracles differ. E-02 added no new root cause but strengthened the evidence for missing checkout validation and showed how authentication expiry can mislead a tester or customer into blaming valid address punctuation. Together, the sessio</w:t>
-      </w:r>
-      <w:r>
-        <w:t>ns show how exploratory work adds system-level insight into token lifecycle, navigation, rendering, and state visibility.</w:t>
-      </w:r>
-    </w:p>
-    <w:p>
-      <w:pPr>
-        <w:pStyle w:val="NormalWeb"/>
-        <w:spacing w:line="480" w:lineRule="auto"/>
-      </w:pPr>
-      <w:r>
-        <w:t>The outcome also illustrates why raw counts require context. The manual suite's eight known roots, Schemathesis's three known roots, and exploratory testing's three novel roots arose under different scopes and oracles. The exploratory findings are therefore reported separately, not used as a direct numerical win over the two API techniques. Human effort for formal suite design and fuzz-tool configuration remains an unavailable retrospective value and must be disclosed rather than reconstructed from tool run</w:t>
-      </w:r>
-      <w:r>
-        <w:t>time.</w:t>
-      </w:r>
-    </w:p>
-    <w:p>
-      <w:pPr>
-        <w:pStyle w:val="NormalWeb"/>
-        <w:spacing w:line="480" w:lineRule="auto"/>
-      </w:pPr>
-      <w:r>
-        <w:t xml:space="preserve">The clearest answer to the research question is that the techniques differed in oracle depth and in the kinds of faults they exposed. The human suite reproduced more known backend defects with far fewer cases because it deliberately crossed ownership boundaries and checked the database after each request. Schemathesis found malformed-input and contract failures repeatedly without requiring each input to be written by hand, but thousands of requests reduced to three root causes. </w:t>
-      </w:r>
+        <w:t>ownership, persistent-state, transaction, and injected-failure oracles. Schemathesis produced far more inputs and repeatedly identified three input-contract failures, but response-level black-box checks could not directly identify missing checkout persistence or partial database transactions.</w:t>
+      </w:r>
+    </w:p>
+    <w:p>
+      <w:pPr>
+        <w:pStyle w:val="NormalWeb"/>
+        <w:spacing w:line="480" w:lineRule="auto"/>
+      </w:pPr>
+      <w:r>
+        <w:t>Generated volume did not translate directly to unique defects: 3,252 formal cases reduced to three already-known root causes. This does not make generation valueless; it demonstrates repeatability across seeds and exercises malformed input classes without manually enumerating them. It also illustrates the study by Sartaj et al. [2], where many generated tests did not expose failures and cost and deduplication remained important.</w:t>
+      </w:r>
+    </w:p>
+    <w:p>
+      <w:pPr>
+        <w:pStyle w:val="NormalWeb"/>
+        <w:spacing w:line="480" w:lineRule="auto"/>
+      </w:pPr>
+      <w:r>
+        <w:t>Exploratory testing found three novel frontend and lifecycle defects because it followed the visible cart-to-order journey instead of stopping at the two API operations. Those findings do not prove that exploratory testing was superior over the primary techniques: scope and oracles differ. E-02 added no new root cause but strengthened the evidence for missing checkout validation and showed how authentication expiry can mislead a tester or customer into blaming valid address punctuation. Together, the sessions show how exploratory work adds system-level insight into token lifecycle, navigation, rendering, and state visibility.</w:t>
+      </w:r>
+    </w:p>
+    <w:p>
+      <w:pPr>
+        <w:pStyle w:val="NormalWeb"/>
+        <w:spacing w:line="480" w:lineRule="auto"/>
+      </w:pPr>
+      <w:r>
+        <w:t>The outcome also illustrates why raw counts require context. The manual suite's eight known roots, Schemathesis's three known roots, and exploratory testing's three novel roots arose under different scopes and oracles. The exploratory findings are therefore reported separately, not used as a direct numerical win over the two API techniques. Human effort for formal suite design and fuzz-tool configuration remains an unavailable retrospective value and must be disclosed rather than reconstructed from tool runtime.</w:t>
+      </w:r>
+    </w:p>
+    <w:p>
+      <w:pPr>
+        <w:pStyle w:val="NormalWeb"/>
+        <w:spacing w:line="480" w:lineRule="auto"/>
+      </w:pPr>
       <w:r>
         <w:lastRenderedPageBreak/>
-        <w:t>In practice, the techniques fit together: generation broadens the input surface, while human-authored tests express business rules that are absent from the response schema.</w:t>
+        <w:t>The clearest answer to the research question is that the techniques differed in oracle depth and in the kinds of faults they exposed. The human suite reproduced more known backend defects with far fewer cases because it deliberately crossed ownership boundaries and checked the database after each request. Schemathesis found malformed-input and contract failures repeatedly without requiring each input to be written by hand, but thousands of requests reduced to three root causes. In practice, the techniques fit together: generation broadens the input surface, while human-authored tests express business rules that are absent from the response schema.</w:t>
       </w:r>
     </w:p>
     <w:p>
@@ -3659,14 +3617,8 @@
         <w:spacing w:line="480" w:lineRule="auto"/>
       </w:pPr>
       <w:r>
-        <w:t xml:space="preserve">Reliability is supported by fixed revisions, dependency versions, seeds, commands, isolated databases, per-case reset, session timestamps, server logs, and JSON snapshots. The tester confirms that exploratory screenshots were taken, but they have not yet been copied into the repository or indexed by filename. The report marks the useful insertion points; until those files are added, the technical claims rely on contemporaneous reports, request logs, snapshots, and source confirmation. HAR was not captured, </w:t>
-      </w:r>
-      <w:r>
-        <w:t xml:space="preserve">but the timestamped Django request logs already </w:t>
-      </w:r>
-      <w:r>
         <w:lastRenderedPageBreak/>
-        <w:t>establish the relevant 400, 401, and 200 responses. Selected E-01 and E-02 logs are explicitly unignored, while other generated artifacts require deliberate preservation before submission.</w:t>
+        <w:t>Reliability is supported by fixed revisions, dependency versions, seeds, commands, isolated databases, per-case reset, session timestamps, server logs, and JSON snapshots. The tester confirms that exploratory screenshots were taken, but they have not yet been copied into the repository or indexed by filename. The report marks the useful insertion points; until those files are added, the technical claims rely on contemporaneous reports, request logs, snapshots, and source confirmation. HAR was not captured, but the timestamped Django request logs already establish the relevant 400, 401, and 200 responses. Selected E-01 and E-02 logs are explicitly unignored, while other generated artifacts require deliberate preservation before submission.</w:t>
       </w:r>
     </w:p>
     <w:p>
@@ -3718,10 +3670,11 @@
         <w:spacing w:line="480" w:lineRule="auto"/>
       </w:pPr>
       <w:r>
-        <w:t>On this application, the 20 human-authored tests reproduced eight known defects because they checked ownership, persistence, and transaction behavior directly. Schemathesis generated 3,252 repeatable cases and exposed three known input-contract defects across every seed, but its response-level checks did not reveal the deeper database problems. Neither formal technique found a new root cause. The exploratory sessions added three new user-visible frontend and authentication-lifecycle defects and reproduced t</w:t>
-      </w:r>
-      <w:r>
-        <w:t>wo known defects, although their broader scope prevents a direct numerical comparison. The practical lesson is to combine focused business-state assertions with generated contract exploration, then use timeboxed exploratory sessions to examine user journeys and confusing failure states that endpoint-only tests do not cover.</w:t>
+        <w:t xml:space="preserve">On this application, the 20 human-authored tests reproduced eight known defects because they checked ownership, persistence, and transaction behavior directly. Schemathesis generated 3,252 repeatable cases and exposed three known input-contract defects across every seed, but its response-level checks did not reveal the deeper database problems. Neither formal technique found a new root cause. The exploratory sessions added three new user-visible frontend and authentication-lifecycle defects and reproduced two known defects, although their broader scope prevents a direct numerical comparison. The practical lesson is to combine focused business-state </w:t>
+      </w:r>
+      <w:r>
+        <w:lastRenderedPageBreak/>
+        <w:t>assertions with generated contract exploration, then use timeboxed exploratory sessions to examine user journeys and confusing failure states that endpoint-only tests do not cover.</w:t>
       </w:r>
     </w:p>
     <w:p>
@@ -3747,20 +3700,46 @@
         <w:spacing w:line="480" w:lineRule="auto"/>
       </w:pPr>
       <w:r>
-        <w:t xml:space="preserve">Future work should expand the endpoint sample to authentication, product, cart-removal, and order-history operations and repeat the experiment on a second application. Additional generators such as RESTler, RESTest, or EvoMaster would show whether the current result is tool-specific. </w:t>
+        <w:t>Future work should expand the endpoint sample to authentication, product, cart-removal, and order-history operations and repeat the experiment on a second application. Additional generators such as RESTler, RESTest, or EvoMaster would show whether the current result is tool-specific. White-box or stateful properties could assert database invariants after generated sequences, reducing the present black-box oracle gap. Mutation testing could evaluate whether the manual suite's 64.5 percent structural coverage corresponds to sensitivity to plausible implementation faults.</w:t>
+      </w:r>
+    </w:p>
+    <w:p>
+      <w:pPr>
+        <w:pStyle w:val="NormalWeb"/>
+        <w:spacing w:line="480" w:lineRule="auto"/>
+      </w:pPr>
+      <w:r>
+        <w:t>The exploratory component would benefit from independent testers who have not seen the implementation or formal findings, counterbalanced charter order, and prospective person-minute effort records. Finally, the recorded baseline defects can be corrected in separate commits and the existing tests converted from expected failures to regression assertions. That follow-up would evaluate repair completeness without rewriting the evidence reported here.</w:t>
+      </w:r>
+    </w:p>
+    <w:p>
+      <w:pPr>
+        <w:pStyle w:val="Heading1"/>
+        <w:spacing w:line="480" w:lineRule="auto"/>
+        <w:rPr>
+          <w:rFonts w:eastAsia="Times New Roman"/>
+        </w:rPr>
+      </w:pPr>
+      <w:bookmarkStart w:id="22" w:name="_Toc235102529"/>
+      <w:r>
+        <w:rPr>
+          <w:rFonts w:eastAsia="Times New Roman"/>
+        </w:rPr>
+        <w:t>Supplementary materials and reproducibility</w:t>
+      </w:r>
+      <w:bookmarkEnd w:id="22"/>
+    </w:p>
+    <w:p>
+      <w:pPr>
+        <w:pStyle w:val="NormalWeb"/>
+        <w:spacing w:line="480" w:lineRule="auto"/>
+      </w:pPr>
+      <w:r>
+        <w:t xml:space="preserve">This report contains the methods, findings, comparisons, challenges, limitations, and conclusions needed to understand the study independently of the project repository. The submitted repository provides supplementary reproducibility material, including the executable human-authored test suite, OpenAPI and Schemathesis configuration, exploratory-testing records, execution logs, database snapshots, and the deduplicated defect register. These artifacts provide an audit trail for </w:t>
       </w:r>
       <w:r>
         <w:lastRenderedPageBreak/>
-        <w:t>White-box or stateful properties could assert database invariants after generated sequences, reducing the present black-box oracle gap. Mutation testing could evaluate whether the manual suite's 64.5 percent structural coverage corresponds to sensitivity to plausible implementation faults.</w:t>
-      </w:r>
-    </w:p>
-    <w:p>
-      <w:pPr>
-        <w:pStyle w:val="NormalWeb"/>
-        <w:spacing w:line="480" w:lineRule="auto"/>
-      </w:pPr>
-      <w:r>
-        <w:t>The exploratory component would benefit from independent testers who have not seen the implementation or formal findings, counterbalanced charter order, and prospective person-minute effort records. Finally, the recorded baseline defects can be corrected in separate commits and the existing tests converted from expected failures to regression assertions. That follow-up would evaluate repair completeness without rewriting the evidence reported here.</w:t>
+        <w:t>the evidence presented in the report and allow the study's procedures and recorded results to be independently examined.</w:t>
       </w:r>
     </w:p>
     <w:p>
@@ -3771,35 +3750,6 @@
           <w:rFonts w:eastAsia="Times New Roman"/>
         </w:rPr>
       </w:pPr>
-      <w:bookmarkStart w:id="22" w:name="_Toc235102529"/>
-      <w:r>
-        <w:rPr>
-          <w:rFonts w:eastAsia="Times New Roman"/>
-        </w:rPr>
-        <w:t>Supplementary materials and reproducibility</w:t>
-      </w:r>
-      <w:bookmarkEnd w:id="22"/>
-    </w:p>
-    <w:p>
-      <w:pPr>
-        <w:pStyle w:val="NormalWeb"/>
-        <w:spacing w:line="480" w:lineRule="auto"/>
-      </w:pPr>
-      <w:r>
-        <w:t xml:space="preserve">This report contains the methods, findings, comparisons, challenges, limitations, and conclusions needed to understand the study independently of the project repository. The submitted repository provides supplementary reproducibility material, including the executable human-authored test suite, OpenAPI and Schemathesis configuration, exploratory-testing records, execution logs, database snapshots, and the deduplicated defect register. These artifacts provide an audit trail for the evidence presented in the </w:t>
-      </w:r>
-      <w:r>
-        <w:t>report and allow the study's procedures and recorded results to be independently examined.</w:t>
-      </w:r>
-    </w:p>
-    <w:p>
-      <w:pPr>
-        <w:pStyle w:val="Heading1"/>
-        <w:spacing w:line="480" w:lineRule="auto"/>
-        <w:rPr>
-          <w:rFonts w:eastAsia="Times New Roman"/>
-        </w:rPr>
-      </w:pPr>
       <w:bookmarkStart w:id="23" w:name="_Toc235102530"/>
       <w:r>
         <w:rPr>
@@ -3815,64 +3765,61 @@
         <w:spacing w:line="480" w:lineRule="auto"/>
       </w:pPr>
       <w:r>
-        <w:t xml:space="preserve">[1] Z. Hatfield-Dodds and D. Dygalo, “Deriving semantics-aware fuzzers from Web API schemas,” in 2022 IEEE/ACM 44th International Conference on Software Engineering: </w:t>
-      </w:r>
+        <w:t>[1] Z. Hatfield-Dodds and D. Dygalo, “Deriving semantics-aware fuzzers from Web API schemas,” in 2022 IEEE/ACM 44th International Conference on Software Engineering: Companion Proceedings, 2022, pp. 345-346, doi: 10.1109/ICSE-Companion55297.2022.9793781.</w:t>
+      </w:r>
+    </w:p>
+    <w:p>
+      <w:pPr>
+        <w:pStyle w:val="NormalWeb"/>
+        <w:spacing w:line="480" w:lineRule="auto"/>
+      </w:pPr>
+      <w:r>
+        <w:t>[2] H. Sartaj, S. Ali, and J. M. Gjøby, “REST API testing in DevOps: A study on an evolving healthcare IoT application,” ACM Transactions on Software Engineering and Methodology, vol. 35, no. 6, pp. 1-46, 2026, doi: 10.1145/3765744.</w:t>
+      </w:r>
+    </w:p>
+    <w:p>
+      <w:pPr>
+        <w:pStyle w:val="NormalWeb"/>
+        <w:spacing w:line="480" w:lineRule="auto"/>
+      </w:pPr>
+      <w:r>
+        <w:t>[3] J. Itkonen and K. Rautiainen, “Exploratory testing: A multiple case study,” in 2005 International Symposium on Empirical Software Engineering, 2005, pp. 84-93, doi: 10.1109/ISESE.2005.1541817.</w:t>
+      </w:r>
+    </w:p>
+    <w:p>
+      <w:pPr>
+        <w:pStyle w:val="NormalWeb"/>
+        <w:spacing w:line="480" w:lineRule="auto"/>
+      </w:pPr>
+      <w:r>
+        <w:t>[4] J. Itkonen, M. V. Mäntylä, and C. Lassenius, “Defect detection efficiency: Test case based vs. exploratory testing,” in First International Symposium on Empirical Software Engineering and Measurement, 2007, pp. 61-70, doi: 10.1109/ESEM.2007.56.</w:t>
+      </w:r>
+    </w:p>
+    <w:p>
+      <w:pPr>
+        <w:pStyle w:val="NormalWeb"/>
+        <w:spacing w:line="480" w:lineRule="auto"/>
+      </w:pPr>
+      <w:r>
+        <w:t>[5] L. Inozemtseva and R. Holmes, “Coverage is not strongly correlated with test suite effectiveness,” in Proceedings of the 36th International Conference on Software Engineering, 2014, pp. 435-445, doi: 10.1145/2568225.2568271.</w:t>
+      </w:r>
+    </w:p>
+    <w:p>
+      <w:pPr>
+        <w:pStyle w:val="NormalWeb"/>
+        <w:spacing w:line="480" w:lineRule="auto"/>
+      </w:pPr>
+      <w:r>
+        <w:t>[6] drf-spectacular, “drf-spectacular documentation.” [Online]. Available: https://drf-spectacular.readthedocs.io/en/stable/. [Accessed: Jul. 16, 2026].</w:t>
+      </w:r>
+    </w:p>
+    <w:p>
+      <w:pPr>
+        <w:pStyle w:val="NormalWeb"/>
+        <w:spacing w:line="480" w:lineRule="auto"/>
+      </w:pPr>
       <w:r>
         <w:lastRenderedPageBreak/>
-        <w:t>Companion Proceedings, 2022, pp. 345-346, doi: 10.1109/ICSE-Companion55297.2022.9793781.</w:t>
-      </w:r>
-    </w:p>
-    <w:p>
-      <w:pPr>
-        <w:pStyle w:val="NormalWeb"/>
-        <w:spacing w:line="480" w:lineRule="auto"/>
-      </w:pPr>
-      <w:r>
-        <w:t>[2] H. Sartaj, S. Ali, and J. M. Gjøby, “REST API testing in DevOps: A study on an evolving healthcare IoT application,” ACM Transactions on Software Engineering and Methodology, vol. 35, no. 6, pp. 1-46, 2026, doi: 10.1145/3765744.</w:t>
-      </w:r>
-    </w:p>
-    <w:p>
-      <w:pPr>
-        <w:pStyle w:val="NormalWeb"/>
-        <w:spacing w:line="480" w:lineRule="auto"/>
-      </w:pPr>
-      <w:r>
-        <w:t>[3] J. Itkonen and K. Rautiainen, “Exploratory testing: A multiple case study,” in 2005 International Symposium on Empirical Software Engineering, 2005, pp. 84-93, doi: 10.1109/ISESE.2005.1541817.</w:t>
-      </w:r>
-    </w:p>
-    <w:p>
-      <w:pPr>
-        <w:pStyle w:val="NormalWeb"/>
-        <w:spacing w:line="480" w:lineRule="auto"/>
-      </w:pPr>
-      <w:r>
-        <w:t>[4] J. Itkonen, M. V. Mäntylä, and C. Lassenius, “Defect detection efficiency: Test case based vs. exploratory testing,” in First International Symposium on Empirical Software Engineering and Measurement, 2007, pp. 61-70, doi: 10.1109/ESEM.2007.56.</w:t>
-      </w:r>
-    </w:p>
-    <w:p>
-      <w:pPr>
-        <w:pStyle w:val="NormalWeb"/>
-        <w:spacing w:line="480" w:lineRule="auto"/>
-      </w:pPr>
-      <w:r>
-        <w:t>[5] L. Inozemtseva and R. Holmes, “Coverage is not strongly correlated with test suite effectiveness,” in Proceedings of the 36th International Conference on Software Engineering, 2014, pp. 435-445, doi: 10.1145/2568225.2568271.</w:t>
-      </w:r>
-    </w:p>
-    <w:p>
-      <w:pPr>
-        <w:pStyle w:val="NormalWeb"/>
-        <w:spacing w:line="480" w:lineRule="auto"/>
-      </w:pPr>
-      <w:r>
-        <w:t>[6] drf-spectacular, “drf-spectacular documentation.” [Online]. Available: https://drf-spectacular.readthedocs.io/en/stable/. [Accessed: Jul. 16, 2026].</w:t>
-      </w:r>
-    </w:p>
-    <w:p>
-      <w:pPr>
-        <w:pStyle w:val="NormalWeb"/>
-        <w:spacing w:line="480" w:lineRule="auto"/>
-      </w:pPr>
-      <w:r>
         <w:t>[7] Schemathesis, “Configuration.” [Online]. Available: https://schemathesis.readthedocs.io/en/stable/configuration/. [Accessed: Jul. 16, 2026].</w:t>
       </w:r>
     </w:p>
@@ -3891,7 +3838,6 @@
         <w:spacing w:line="480" w:lineRule="auto"/>
       </w:pPr>
       <w:r>
-        <w:lastRenderedPageBreak/>
         <w:t>[9] Coverage.py, “Branch coverage measurement.” [Online]. Available: https://coverage.readthedocs.io/en/latest/branch.html. [Accessed: Jul. 16, 2026].</w:t>
       </w:r>
     </w:p>
@@ -4616,7 +4562,6 @@
   <w:style w:type="character" w:default="1" w:styleId="DefaultParagraphFont">
     <w:name w:val="Default Paragraph Font"/>
     <w:uiPriority w:val="1"/>
-    <w:semiHidden/>
     <w:unhideWhenUsed/>
   </w:style>
   <w:style w:type="table" w:default="1" w:styleId="TableNormal">
@@ -4696,8 +4641,8 @@
       <w:jc w:val="both"/>
     </w:pPr>
   </w:style>
-  <w:style w:type="paragraph" w:customStyle="1" w:styleId="title">
-    <w:name w:val="title"/>
+  <w:style w:type="paragraph" w:customStyle="1" w:styleId="Title1">
+    <w:name w:val="Title1"/>
     <w:basedOn w:val="Normal"/>
     <w:pPr>
       <w:spacing w:before="100" w:beforeAutospacing="1" w:after="100" w:afterAutospacing="1"/>

</xml_diff>